<commit_message>
v7.4.3-10: Monatsabschluss-Reset nur bei tatsaechlichen Aenderungen
</commit_message>
<xml_diff>
--- a/downloads/PZE-Anleitung-Projektleiter-v2_0_1.docx
+++ b/downloads/PZE-Anleitung-Projektleiter-v2_0_1.docx
@@ -390,6 +390,9 @@
     <w:p>
       <w:pPr>
         <w:spacing w:after="60"/>
+        <w:rPr>
+          <w:color w:val="666666"/>
+        </w:rPr>
       </w:pPr>
       <w:r>
         <w:rPr>
@@ -411,6 +414,165 @@
         </w:rPr>
         <w:t xml:space="preserve"> zur Verfügung stehen. Mitarbeiter-Funktionen (Zeiterfassung, Mein Status) sind ebenfalls enthalten, da Projektleiter alle Rechte der Mitarbeiter-Rolle besitzen.</w:t>
       </w:r>
+    </w:p>
+    <w:p>
+      <w:pPr>
+        <w:spacing w:after="60"/>
+        <w:rPr>
+          <w:color w:val="666666"/>
+        </w:rPr>
+      </w:pPr>
+    </w:p>
+    <w:p>
+      <w:pPr>
+        <w:spacing w:after="60"/>
+        <w:rPr>
+          <w:color w:val="666666"/>
+        </w:rPr>
+      </w:pPr>
+    </w:p>
+    <w:p>
+      <w:pPr>
+        <w:spacing w:after="60"/>
+      </w:pPr>
+    </w:p>
+    <w:tbl>
+      <w:tblPr>
+        <w:tblW w:w="9638" w:type="dxa"/>
+        <w:tblBorders>
+          <w:top w:val="single" w:sz="4" w:space="0" w:color="auto"/>
+          <w:left w:val="single" w:sz="4" w:space="0" w:color="auto"/>
+          <w:bottom w:val="single" w:sz="4" w:space="0" w:color="auto"/>
+          <w:right w:val="single" w:sz="4" w:space="0" w:color="auto"/>
+          <w:insideH w:val="single" w:sz="4" w:space="0" w:color="auto"/>
+          <w:insideV w:val="single" w:sz="4" w:space="0" w:color="auto"/>
+        </w:tblBorders>
+        <w:tblCellMar>
+          <w:left w:w="10" w:type="dxa"/>
+          <w:right w:w="10" w:type="dxa"/>
+        </w:tblCellMar>
+        <w:tblLook w:val="04A0" w:firstRow="1" w:lastRow="0" w:firstColumn="1" w:lastColumn="0" w:noHBand="0" w:noVBand="1"/>
+      </w:tblPr>
+      <w:tblGrid>
+        <w:gridCol w:w="9638"/>
+      </w:tblGrid>
+      <w:tr>
+        <w:tblPrEx>
+          <w:tblCellMar>
+            <w:top w:w="0" w:type="dxa"/>
+            <w:bottom w:w="0" w:type="dxa"/>
+          </w:tblCellMar>
+        </w:tblPrEx>
+        <w:tc>
+          <w:tcPr>
+            <w:tcW w:w="9638" w:type="dxa"/>
+            <w:tcBorders>
+              <w:top w:val="single" w:sz="6" w:space="0" w:color="E0A000"/>
+              <w:left w:val="single" w:sz="18" w:space="0" w:color="E0A000"/>
+              <w:bottom w:val="single" w:sz="6" w:space="0" w:color="E0A000"/>
+              <w:right w:val="single" w:sz="6" w:space="0" w:color="E0A000"/>
+            </w:tcBorders>
+            <w:shd w:val="clear" w:color="auto" w:fill="FFFBE6"/>
+            <w:tcMar>
+              <w:top w:w="120" w:type="dxa"/>
+              <w:left w:w="160" w:type="dxa"/>
+              <w:bottom w:w="120" w:type="dxa"/>
+              <w:right w:w="160" w:type="dxa"/>
+            </w:tcMar>
+          </w:tcPr>
+          <w:p>
+            <w:pPr>
+              <w:rPr>
+                <w:b/>
+                <w:bCs/>
+                <w:color w:val="7A5500"/>
+              </w:rPr>
+            </w:pPr>
+            <w:r>
+              <w:rPr>
+                <w:b/>
+                <w:bCs/>
+                <w:color w:val="7A5500"/>
+              </w:rPr>
+              <w:t xml:space="preserve">Wichtiger Hinweis:  </w:t>
+            </w:r>
+          </w:p>
+          <w:p>
+            <w:pPr>
+              <w:rPr>
+                <w:b/>
+                <w:bCs/>
+                <w:color w:val="7A5500"/>
+              </w:rPr>
+            </w:pPr>
+          </w:p>
+          <w:p>
+            <w:pPr>
+              <w:rPr>
+                <w:color w:val="7A5500"/>
+              </w:rPr>
+            </w:pPr>
+            <w:r>
+              <w:rPr>
+                <w:color w:val="7A5500"/>
+              </w:rPr>
+              <w:t xml:space="preserve">Das PZE-System befindet sich im Testbetrieb. Änderungen an Funktionen und Layout sind jederzeit möglich. </w:t>
+            </w:r>
+          </w:p>
+          <w:p>
+            <w:pPr>
+              <w:rPr>
+                <w:color w:val="7A5500"/>
+              </w:rPr>
+            </w:pPr>
+          </w:p>
+          <w:p>
+            <w:pPr>
+              <w:rPr>
+                <w:color w:val="7A5500"/>
+              </w:rPr>
+            </w:pPr>
+            <w:r>
+              <w:rPr>
+                <w:color w:val="7A5500"/>
+              </w:rPr>
+              <w:t xml:space="preserve">Ihr </w:t>
+            </w:r>
+            <w:r>
+              <w:rPr>
+                <w:color w:val="7A5500"/>
+              </w:rPr>
+              <w:t>Ansprechpartner</w:t>
+            </w:r>
+            <w:r>
+              <w:rPr>
+                <w:color w:val="7A5500"/>
+              </w:rPr>
+              <w:t xml:space="preserve"> für Rückfragen oder Fehlerhinweise: </w:t>
+            </w:r>
+          </w:p>
+          <w:p>
+            <w:pPr>
+              <w:rPr>
+                <w:color w:val="7A5500"/>
+              </w:rPr>
+            </w:pPr>
+          </w:p>
+          <w:p>
+            <w:r>
+              <w:rPr>
+                <w:color w:val="7A5500"/>
+              </w:rPr>
+              <w:t>Martin Ditscherlein, m.ditscherlein@cubintec.com</w:t>
+            </w:r>
+          </w:p>
+        </w:tc>
+      </w:tr>
+    </w:tbl>
+    <w:p>
+      <w:pPr>
+        <w:spacing w:before="400"/>
+      </w:pPr>
     </w:p>
     <w:p>
       <w:pPr>

</xml_diff>